<commit_message>
test(capture): emulator end-to-end run, review inbox widget tests; PRD 13E, Play SMS declaration
- integration_test/capture_e2e_test.dart + tool/run_capture_e2e.sh: a real
  Android notification and real inbox SMS travel through the listener, the
  platform channel, the pipeline and a SQLCipher vault into the review inbox;
  an SMS from a phone number never arrives.
- test/widget/capture_inbox_screen_test.dart: approve, correct and approve,
  empty amount blocked, reject and restore, undo, through the real buttons,
  review service and database.
- Khazana_PRD_v3.docx: new 13E, automatic capture (sources, on-device
  handling, the auto-post policy change, review inbox, SMS history).
- docs/play-store/sms-permission-declaration.md: draft answers, data handling
  and demo script for Play's SMS permissions declaration.

Co-Authored-By: Claude Opus 5.5 <noreply@anthropic.com>
</commit_message>
<xml_diff>
--- a/Khazana_PRD_v3.docx
+++ b/Khazana_PRD_v3.docx
@@ -18027,6 +18027,184 @@
         </w:pBdr>
         <w:spacing w:after="200" w:before="200"/>
       </w:pPr>
+    </w:p>
+    <w:p>
+      <w:pPr>
+        <w:pStyle w:val="Heading2"/>
+        <w:spacing w:after="120" w:before="360"/>
+      </w:pPr>
+      <w:r>
+        <w:rPr>
+          <w:rFonts w:ascii="Arial" w:cs="Arial" w:eastAsia="Arial" w:hAnsi="Arial"/>
+          <w:b/>
+          <w:bCs/>
+          <w:color w:val="1E293B"/>
+          <w:sz w:val="28"/>
+          <w:szCs w:val="28"/>
+        </w:rPr>
+        <w:t>13E. Automatic Capture from Bank Alerts (v2)</w:t>
+      </w:r>
+    </w:p>
+    <w:p>
+      <w:pPr>
+        <w:pStyle w:val="ListParagraph"/>
+        <w:numPr>
+          <w:ilvl w:val="0"/>
+          <w:numId w:val="3"/>
+        </w:numPr>
+        <w:spacing w:after="40" w:before="40"/>
+      </w:pPr>
+      <w:r>
+        <w:rPr>
+          <w:rFonts w:ascii="Arial" w:cs="Arial" w:eastAsia="Arial" w:hAnsi="Arial"/>
+          <w:color w:val="1E293B"/>
+          <w:sz w:val="22"/>
+          <w:szCs w:val="22"/>
+        </w:rPr>
+        <w:t>Sources: bank and UPI payment notifications through the Android notification listener (every Android build), and bank SMS in the sideload build only, until Google Play approves Khazana under the "SMS-based money management" exception of its SMS policy. iOS exposes neither; iPhone capture is planned through a Shortcuts automation and screenshot OCR.</w:t>
+      </w:r>
+    </w:p>
+    <w:p>
+      <w:pPr>
+        <w:pStyle w:val="ListParagraph"/>
+        <w:numPr>
+          <w:ilvl w:val="0"/>
+          <w:numId w:val="3"/>
+        </w:numPr>
+        <w:spacing w:after="40" w:before="40"/>
+      </w:pPr>
+      <w:r>
+        <w:rPr>
+          <w:rFonts w:ascii="Arial" w:cs="Arial" w:eastAsia="Arial" w:hAnsi="Arial"/>
+          <w:color w:val="1E293B"/>
+          <w:sz w:val="22"/>
+          <w:szCs w:val="22"/>
+        </w:rPr>
+        <w:t>On-device only: the raw message is parsed in memory and discarded. Only amount, direction, merchant, date, the last four digits of the account, the UPI reference and the stated balance are kept. SMS from ordinary phone numbers are dropped in the Android code and never reach Dart.</w:t>
+      </w:r>
+    </w:p>
+    <w:p>
+      <w:pPr>
+        <w:pStyle w:val="ListParagraph"/>
+        <w:numPr>
+          <w:ilvl w:val="0"/>
+          <w:numId w:val="3"/>
+        </w:numPr>
+        <w:spacing w:after="40" w:before="40"/>
+      </w:pPr>
+      <w:r>
+        <w:rPr>
+          <w:rFonts w:ascii="Arial" w:cs="Arial" w:eastAsia="Arial" w:hAnsi="Arial"/>
+          <w:color w:val="1E293B"/>
+          <w:sz w:val="22"/>
+          <w:szCs w:val="22"/>
+        </w:rPr>
+        <w:t>Pipeline: parse → fingerprint duplicate check (against every capture, whatever its status) → account match on the last four digits → router score 0–100 → post or queue. Captures live in the pending_captures table (Drift schema v7, SQLCipher).</w:t>
+      </w:r>
+    </w:p>
+    <w:p>
+      <w:pPr>
+        <w:pStyle w:val="ListParagraph"/>
+        <w:numPr>
+          <w:ilvl w:val="0"/>
+          <w:numId w:val="3"/>
+        </w:numPr>
+        <w:spacing w:after="40" w:before="40"/>
+      </w:pPr>
+      <w:r>
+        <w:rPr>
+          <w:rFonts w:ascii="Arial" w:cs="Arial" w:eastAsia="Arial" w:hAnsi="Arial"/>
+          <w:color w:val="1E293B"/>
+          <w:sz w:val="22"/>
+          <w:szCs w:val="22"/>
+        </w:rPr>
+        <w:t>Policy change from v1: v1 never saved a capture without review. v2 posts a capture automatically when it scores 80 or more and has no forced-review reason; a recognised bank, a linked account, a learned category and a merchant are enough. Every automatic add is announced with Undo.</w:t>
+      </w:r>
+    </w:p>
+    <w:p>
+      <w:pPr>
+        <w:pStyle w:val="ListParagraph"/>
+        <w:numPr>
+          <w:ilvl w:val="0"/>
+          <w:numId w:val="3"/>
+        </w:numPr>
+        <w:spacing w:after="40" w:before="40"/>
+      </w:pPr>
+      <w:r>
+        <w:rPr>
+          <w:rFonts w:ascii="Arial" w:cs="Arial" w:eastAsia="Arial" w:hAnsi="Arial"/>
+          <w:color w:val="1E293B"/>
+          <w:sz w:val="22"/>
+          <w:szCs w:val="22"/>
+        </w:rPr>
+        <w:t>The "Add confident captures automatically" switch (on by default) turns this off; with it off, every capture waits for review, which is the v1 behaviour.</w:t>
+      </w:r>
+    </w:p>
+    <w:p>
+      <w:pPr>
+        <w:pStyle w:val="ListParagraph"/>
+        <w:numPr>
+          <w:ilvl w:val="0"/>
+          <w:numId w:val="3"/>
+        </w:numPr>
+        <w:spacing w:after="40" w:before="40"/>
+      </w:pPr>
+      <w:r>
+        <w:rPr>
+          <w:rFonts w:ascii="Arial" w:cs="Arial" w:eastAsia="Arial" w:hAnsi="Arial"/>
+          <w:color w:val="1E293B"/>
+          <w:sz w:val="22"/>
+          <w:szCs w:val="22"/>
+        </w:rPr>
+        <w:t>Always sent to review: unknown account, no learned category, balance mismatch, refund, card bill payment, possible transfer between own accounts, unusually large amount (over 3× the account's 95th percentile), a likely hand-typed duplicate, and anything the user undid.</w:t>
+      </w:r>
+    </w:p>
+    <w:p>
+      <w:pPr>
+        <w:pStyle w:val="ListParagraph"/>
+        <w:numPr>
+          <w:ilvl w:val="0"/>
+          <w:numId w:val="3"/>
+        </w:numPr>
+        <w:spacing w:after="40" w:before="40"/>
+      </w:pPr>
+      <w:r>
+        <w:rPr>
+          <w:rFonts w:ascii="Arial" w:cs="Arial" w:eastAsia="Arial" w:hAnsi="Arial"/>
+          <w:color w:val="1E293B"/>
+          <w:sz w:val="22"/>
+          <w:szCs w:val="22"/>
+        </w:rPr>
+        <w:t>Review inbox: Approve (as read), Save &amp; approve (corrected amount or direction; both the parsed and the confirmed amount are stored), Reject, and Undo or Restore for the last 7 days. Approving teaches merchant → category and, optionally, last four digits → account, so the next alert from the same source can post by itself.</w:t>
+      </w:r>
+    </w:p>
+    <w:p>
+      <w:pPr>
+        <w:pStyle w:val="ListParagraph"/>
+        <w:numPr>
+          <w:ilvl w:val="0"/>
+          <w:numId w:val="3"/>
+        </w:numPr>
+        <w:spacing w:after="40" w:before="40"/>
+      </w:pPr>
+      <w:r>
+        <w:rPr>
+          <w:rFonts w:ascii="Arial" w:cs="Arial" w:eastAsia="Arial" w:hAnsi="Arial"/>
+          <w:color w:val="1E293B"/>
+          <w:sz w:val="22"/>
+          <w:szCs w:val="22"/>
+        </w:rPr>
+        <w:t>SMS history: on request, the last 90 days of the SMS inbox are imported through the same pipeline; on each unlock, a catch-up scan reads messages since the last scan with a one-hour overlap, and duplicates are dropped by fingerprint.</w:t>
+      </w:r>
+    </w:p>
+    <w:p>
+      <w:pPr>
+        <w:pBdr>
+          <w:bottom w:val="single" w:color="CBD5E1" w:sz="1"/>
+        </w:pBdr>
+        <w:spacing w:after="200" w:before="200"/>
+      </w:pPr>
+      <w:r/>
     </w:p>
     <w:p>
       <w:pPr>

</xml_diff>